<commit_message>
Brief: section 13 gains daily Sentry+PostHog report via CI agent + daily scheduled tests; cost box gains GitHub Actions pricing line
</commit_message>
<xml_diff>
--- a/slides/ai-first-technical-brief.docx
+++ b/slides/ai-first-technical-brief.docx
@@ -2575,6 +2575,31 @@
               <w:t xml:space="preserve">flat subscription from ~$199/month per parallel (paid even on idle days; scaling multiplies it) — full pricing not public.</w:t>
             </w:r>
           </w:p>
+          <w:p>
+            <w:pPr>
+              <w:spacing w:after="60" w:line="280"/>
+            </w:pPr>
+            <w:r>
+              <w:rPr>
+                <w:rFonts w:ascii="Calibri" w:cs="Calibri" w:eastAsia="Calibri" w:hAnsi="Calibri"/>
+                <w:b/>
+                <w:bCs/>
+                <w:color w:val="222222"/>
+                <w:sz w:val="20"/>
+                <w:szCs w:val="20"/>
+              </w:rPr>
+              <w:t xml:space="preserve">GitHub Actions (the orchestrator):  </w:t>
+            </w:r>
+            <w:r>
+              <w:rPr>
+                <w:rFonts w:ascii="Calibri" w:cs="Calibri" w:eastAsia="Calibri" w:hAnsi="Calibri"/>
+                <w:color w:val="222222"/>
+                <w:sz w:val="20"/>
+                <w:szCs w:val="20"/>
+              </w:rPr>
+              <w:t xml:space="preserve">2,000–3,000 free minutes/month included in the plan; beyond that, Linux $0.008/min and macOS $0.08/min (macOS counts 10x against the quota). Our expected load — nightly Android on Linux, iOS twice a week, daily Test Lab dispatch, CI-agent reviews and reports — ≈ $0–15/month.</w:t>
+            </w:r>
+          </w:p>
         </w:tc>
       </w:tr>
     </w:tbl>
@@ -2737,6 +2762,60 @@
           <w:szCs w:val="22"/>
         </w:rPr>
         <w:t xml:space="preserve">The whole chain runs under the same guards: Sentry stays read-only, destinations are fixed, push and merge require human approval — automation gains speed, never extra authority.</w:t>
+      </w:r>
+    </w:p>
+    <w:p>
+      <w:pPr>
+        <w:spacing w:after="80" w:line="300"/>
+      </w:pPr>
+      <w:r>
+        <w:rPr>
+          <w:rFonts w:ascii="Calibri" w:cs="Calibri" w:eastAsia="Calibri" w:hAnsi="Calibri"/>
+          <w:b/>
+          <w:bCs/>
+          <w:color w:val="222222"/>
+          <w:sz w:val="20"/>
+          <w:szCs w:val="20"/>
+        </w:rPr>
+        <w:t xml:space="preserve">Scheduled automation — all driven from GitHub Actions:</w:t>
+      </w:r>
+    </w:p>
+    <w:p>
+      <w:pPr>
+        <w:spacing w:after="80" w:line="290"/>
+        <w:ind w:left="280"/>
+      </w:pPr>
+      <w:r>
+        <w:rPr>
+          <w:rFonts w:ascii="Calibri" w:cs="Calibri" w:eastAsia="Calibri" w:hAnsi="Calibri"/>
+          <w:b w:val="false"/>
+          <w:bCs w:val="false"/>
+          <w:i w:val="false"/>
+          <w:iCs w:val="false"/>
+          <w:color w:val="222222"/>
+          <w:sz w:val="22"/>
+          <w:szCs w:val="22"/>
+        </w:rPr>
+        <w:t xml:space="preserve">–  Daily morning report: a CI agent (headless Cursor agent in GitHub Actions, authenticated by API key) pulls yesterday's Sentry errors and PostHog user-behavior data and posts one combined report before the workday starts — system health and user behavior in a single view.</w:t>
+      </w:r>
+    </w:p>
+    <w:p>
+      <w:pPr>
+        <w:spacing w:after="80" w:line="290"/>
+        <w:ind w:left="280"/>
+      </w:pPr>
+      <w:r>
+        <w:rPr>
+          <w:rFonts w:ascii="Calibri" w:cs="Calibri" w:eastAsia="Calibri" w:hAnsi="Calibri"/>
+          <w:b w:val="false"/>
+          <w:bCs w:val="false"/>
+          <w:i w:val="false"/>
+          <w:iCs w:val="false"/>
+          <w:color w:val="222222"/>
+          <w:sz w:val="22"/>
+          <w:szCs w:val="22"/>
+        </w:rPr>
+        <w:t xml:space="preserve">–  Daily test runs: the full suite executes every night on iOS/Android emulators in GitHub Actions, plus scheduled Firebase Test Lab runs on real devices — deterministic, no AI involved, near-zero cost.</w:t>
       </w:r>
     </w:p>
     <w:tbl>

</xml_diff>

<commit_message>
Brief: section 14 — adopted real-time bug-fix pipeline plan (relay, staging clone, PR to qa, nightly pg_dump to S3)
</commit_message>
<xml_diff>
--- a/slides/ai-first-technical-brief.docx
+++ b/slides/ai-first-technical-brief.docx
@@ -2816,6 +2816,154 @@
           <w:szCs w:val="22"/>
         </w:rPr>
         <w:t xml:space="preserve">–  Daily test runs: the full suite executes every night on iOS/Android emulators in GitHub Actions, plus scheduled Firebase Test Lab runs on real devices — deterministic, no AI involved, near-zero cost.</w:t>
+      </w:r>
+    </w:p>
+    <w:p>
+      <w:pPr>
+        <w:pStyle w:val="Heading1"/>
+        <w:spacing w:after="140" w:before="320"/>
+      </w:pPr>
+      <w:r>
+        <w:rPr>
+          <w:rFonts w:ascii="Calibri" w:cs="Calibri" w:eastAsia="Calibri" w:hAnsi="Calibri"/>
+          <w:b/>
+          <w:bCs/>
+          <w:color w:val="1F3864"/>
+          <w:sz w:val="30"/>
+          <w:szCs w:val="30"/>
+        </w:rPr>
+        <w:t xml:space="preserve">14. Real-Time Bug-Fix Pipeline — Adopted Implementation Plan</w:t>
+      </w:r>
+    </w:p>
+    <w:p>
+      <w:pPr>
+        <w:spacing w:after="120" w:line="300"/>
+      </w:pPr>
+      <w:r>
+        <w:rPr>
+          <w:rFonts w:ascii="Calibri" w:cs="Calibri" w:eastAsia="Calibri" w:hAnsi="Calibri"/>
+          <w:b w:val="false"/>
+          <w:bCs w:val="false"/>
+          <w:i w:val="false"/>
+          <w:iCs w:val="false"/>
+          <w:color w:val="222222"/>
+          <w:sz w:val="22"/>
+          <w:szCs w:val="22"/>
+        </w:rPr>
+        <w:t xml:space="preserve">The adopted design turns the chain in section 13 into a seconds-level reaction, with zero servers to run or maintain:</w:t>
+      </w:r>
+    </w:p>
+    <w:p>
+      <w:pPr>
+        <w:spacing w:after="80" w:line="290"/>
+        <w:ind w:left="280"/>
+      </w:pPr>
+      <w:r>
+        <w:rPr>
+          <w:rFonts w:ascii="Calibri" w:cs="Calibri" w:eastAsia="Calibri" w:hAnsi="Calibri"/>
+          <w:b w:val="false"/>
+          <w:bCs w:val="false"/>
+          <w:i w:val="false"/>
+          <w:iCs w:val="false"/>
+          <w:color w:val="222222"/>
+          <w:sz w:val="22"/>
+          <w:szCs w:val="22"/>
+        </w:rPr>
+        <w:t xml:space="preserve">–  Trigger: a Sentry alert rule (new issues only, error level and above) fires a webhook to a tiny relay — ~20 lines on Cloudflare Workers (free tier), protected by a shared key. The relay's only job is to trigger the Bug Fix Agent workflow in the right repository through the GitHub API.</w:t>
+      </w:r>
+    </w:p>
+    <w:p>
+      <w:pPr>
+        <w:spacing w:after="80" w:line="290"/>
+        <w:ind w:left="280"/>
+      </w:pPr>
+      <w:r>
+        <w:rPr>
+          <w:rFonts w:ascii="Calibri" w:cs="Calibri" w:eastAsia="Calibri" w:hAnsi="Calibri"/>
+          <w:b w:val="false"/>
+          <w:bCs w:val="false"/>
+          <w:i w:val="false"/>
+          <w:iCs w:val="false"/>
+          <w:color w:val="222222"/>
+          <w:sz w:val="22"/>
+          <w:szCs w:val="22"/>
+        </w:rPr>
+        <w:t xml:space="preserve">–  The agent (GitHub Actions + Cursor CLI, authenticated by API key): reads the issue and stack trace from Sentry (strictly read-only) → creates or reuses the Linear ticket (Sentry label, problem-only body, close-out section) → moves it to In Progress.</w:t>
+      </w:r>
+    </w:p>
+    <w:p>
+      <w:pPr>
+        <w:spacing w:after="80" w:line="290"/>
+        <w:ind w:left="280"/>
+      </w:pPr>
+      <w:r>
+        <w:rPr>
+          <w:rFonts w:ascii="Calibri" w:cs="Calibri" w:eastAsia="Calibri" w:hAnsi="Calibri"/>
+          <w:b w:val="false"/>
+          <w:bCs w:val="false"/>
+          <w:i w:val="false"/>
+          <w:iCs w:val="false"/>
+          <w:color w:val="222222"/>
+          <w:sz w:val="22"/>
+          <w:szCs w:val="22"/>
+        </w:rPr>
+        <w:t xml:space="preserve">–  The fix: branches from staging — the code closest to what is actually broken in production — writes a failing test that reproduces the bug, fixes the root cause, runs the FULL suite, then opens one PR into qa so daily work on dev is never disturbed. The same fix is also carried back to dev, so the next promotion cannot re-introduce the bug.</w:t>
+      </w:r>
+    </w:p>
+    <w:p>
+      <w:pPr>
+        <w:spacing w:after="80" w:line="290"/>
+        <w:ind w:left="280"/>
+      </w:pPr>
+      <w:r>
+        <w:rPr>
+          <w:rFonts w:ascii="Calibri" w:cs="Calibri" w:eastAsia="Calibri" w:hAnsi="Calibri"/>
+          <w:b w:val="false"/>
+          <w:bCs w:val="false"/>
+          <w:i w:val="false"/>
+          <w:iCs w:val="false"/>
+          <w:color w:val="222222"/>
+          <w:sz w:val="22"/>
+          <w:szCs w:val="22"/>
+        </w:rPr>
+        <w:t xml:space="preserve">–  Database (backend): a nightly pg_dump runs INSIDE our network and uploads to private storage (S3). The CI job downloads the latest dump into a disposable local PostgreSQL container that dies with the run. Staging is never exposed: no inbound access, no IP allowlisting — GitHub-hosted runners have no static IPs, so this design removes the question entirely.</w:t>
+      </w:r>
+    </w:p>
+    <w:p>
+      <w:pPr>
+        <w:spacing w:after="80" w:line="290"/>
+        <w:ind w:left="280"/>
+      </w:pPr>
+      <w:r>
+        <w:rPr>
+          <w:rFonts w:ascii="Calibri" w:cs="Calibri" w:eastAsia="Calibri" w:hAnsi="Calibri"/>
+          <w:b w:val="false"/>
+          <w:bCs w:val="false"/>
+          <w:i w:val="false"/>
+          <w:iCs w:val="false"/>
+          <w:color w:val="222222"/>
+          <w:sz w:val="22"/>
+          <w:szCs w:val="22"/>
+        </w:rPr>
+        <w:t xml:space="preserve">–  Closure: the agent comments the root cause, changed files, test added, and the PR link on the Linear ticket, then moves it to the status “In Review from AI”. A human reviews and merges; production still only accepts staging through the promotion gate.</w:t>
+      </w:r>
+    </w:p>
+    <w:p>
+      <w:pPr>
+        <w:spacing w:after="120" w:line="300"/>
+      </w:pPr>
+      <w:r>
+        <w:rPr>
+          <w:rFonts w:ascii="Calibri" w:cs="Calibri" w:eastAsia="Calibri" w:hAnsi="Calibri"/>
+          <w:b w:val="false"/>
+          <w:bCs w:val="false"/>
+          <w:i w:val="false"/>
+          <w:iCs w:val="false"/>
+          <w:color w:val="222222"/>
+          <w:sz w:val="22"/>
+          <w:szCs w:val="22"/>
+        </w:rPr>
+        <w:t xml:space="preserve">Required secrets: CURSOR_API_KEY, SENTRY_AUTH_TOKEN (read-only scopes), LINEAR_API_KEY, and read keys for the dump storage. Safety rails: one run per issue (concurrency lock), a PR is never opened with failing tests, Sentry stays read-only end to end, and merging remains a human decision.</w:t>
       </w:r>
     </w:p>
     <w:tbl>

</xml_diff>

<commit_message>
Brief: section 3 rewritten Cursor-accurate — three permission buckets realized via allowlist/built-in approval/repo hooks instead of a settings file
</commit_message>
<xml_diff>
--- a/slides/ai-first-technical-brief.docx
+++ b/slides/ai-first-technical-brief.docx
@@ -227,7 +227,25 @@
           <w:sz w:val="30"/>
           <w:szCs w:val="30"/>
         </w:rPr>
-        <w:t xml:space="preserve">3. Permissions — Scoped Access</w:t>
+        <w:t xml:space="preserve">3. Permissions — Scoped Access (as realized in Cursor)</w:t>
+      </w:r>
+    </w:p>
+    <w:p>
+      <w:pPr>
+        <w:spacing w:after="120" w:line="300"/>
+      </w:pPr>
+      <w:r>
+        <w:rPr>
+          <w:rFonts w:ascii="Calibri" w:cs="Calibri" w:eastAsia="Calibri" w:hAnsi="Calibri"/>
+          <w:b w:val="false"/>
+          <w:bCs w:val="false"/>
+          <w:i w:val="false"/>
+          <w:iCs w:val="false"/>
+          <w:color w:val="222222"/>
+          <w:sz w:val="22"/>
+          <w:szCs w:val="22"/>
+        </w:rPr>
+        <w:t xml:space="preserve">The three-bucket principle — routine work flows without friction, consequential actions stop at a human, dangerous ones are impossible — is enforced in Cursor by three complementary mechanisms rather than a single file:</w:t>
       </w:r>
     </w:p>
     <w:tbl>
@@ -243,14 +261,14 @@
         </w:tblBorders>
       </w:tblPr>
       <w:tblGrid>
-        <w:gridCol w:w="2500"/>
-        <w:gridCol w:w="2900"/>
+        <w:gridCol w:w="2700"/>
         <w:gridCol w:w="3800"/>
+        <w:gridCol w:w="2700"/>
       </w:tblGrid>
       <w:tr>
         <w:tc>
           <w:tcPr>
-            <w:tcW w:type="dxa" w:w="2500"/>
+            <w:tcW w:type="dxa" w:w="2700"/>
             <w:tcBorders>
               <w:top w:val="single" w:color="BFBFBF" w:sz="4"/>
               <w:left w:val="single" w:color="BFBFBF" w:sz="4"/>
@@ -284,7 +302,7 @@
         </w:tc>
         <w:tc>
           <w:tcPr>
-            <w:tcW w:type="dxa" w:w="2900"/>
+            <w:tcW w:type="dxa" w:w="3800"/>
             <w:tcBorders>
               <w:top w:val="single" w:color="BFBFBF" w:sz="4"/>
               <w:left w:val="single" w:color="BFBFBF" w:sz="4"/>
@@ -312,13 +330,13 @@
                 <w:sz w:val="20"/>
                 <w:szCs w:val="20"/>
               </w:rPr>
-              <w:t xml:space="preserve">Criterion</w:t>
-            </w:r>
-          </w:p>
-        </w:tc>
-        <w:tc>
-          <w:tcPr>
-            <w:tcW w:type="dxa" w:w="3800"/>
+              <w:t xml:space="preserve">Mechanism in Cursor</w:t>
+            </w:r>
+          </w:p>
+        </w:tc>
+        <w:tc>
+          <w:tcPr>
+            <w:tcW w:type="dxa" w:w="2700"/>
             <w:tcBorders>
               <w:top w:val="single" w:color="BFBFBF" w:sz="4"/>
               <w:left w:val="single" w:color="BFBFBF" w:sz="4"/>
@@ -354,73 +372,73 @@
       <w:tr>
         <w:tc>
           <w:tcPr>
-            <w:tcW w:type="dxa" w:w="2500"/>
-            <w:tcBorders>
-              <w:top w:val="single" w:color="BFBFBF" w:sz="4"/>
-              <w:left w:val="single" w:color="BFBFBF" w:sz="4"/>
-              <w:bottom w:val="single" w:color="BFBFBF" w:sz="4"/>
-              <w:right w:val="single" w:color="BFBFBF" w:sz="4"/>
-            </w:tcBorders>
-            <w:tcMar>
-              <w:top w:type="dxa" w:w="60"/>
-              <w:left w:type="dxa" w:w="100"/>
-              <w:bottom w:type="dxa" w:w="60"/>
-              <w:right w:type="dxa" w:w="100"/>
-            </w:tcMar>
-          </w:tcPr>
-          <w:p>
-            <w:pPr>
-              <w:spacing w:after="0" w:line="270"/>
-            </w:pPr>
-            <w:r>
-              <w:rPr>
-                <w:rFonts w:ascii="Calibri" w:cs="Calibri" w:eastAsia="Calibri" w:hAnsi="Calibri"/>
-                <w:b w:val="false"/>
-                <w:bCs w:val="false"/>
-                <w:color w:val="222222"/>
-                <w:sz w:val="20"/>
-                <w:szCs w:val="20"/>
-              </w:rPr>
-              <w:t xml:space="preserve">Allow — no prompt</w:t>
-            </w:r>
-          </w:p>
-        </w:tc>
-        <w:tc>
-          <w:tcPr>
-            <w:tcW w:type="dxa" w:w="2900"/>
-            <w:tcBorders>
-              <w:top w:val="single" w:color="BFBFBF" w:sz="4"/>
-              <w:left w:val="single" w:color="BFBFBF" w:sz="4"/>
-              <w:bottom w:val="single" w:color="BFBFBF" w:sz="4"/>
-              <w:right w:val="single" w:color="BFBFBF" w:sz="4"/>
-            </w:tcBorders>
-            <w:tcMar>
-              <w:top w:type="dxa" w:w="60"/>
-              <w:left w:type="dxa" w:w="100"/>
-              <w:bottom w:type="dxa" w:w="60"/>
-              <w:right w:type="dxa" w:w="100"/>
-            </w:tcMar>
-          </w:tcPr>
-          <w:p>
-            <w:pPr>
-              <w:spacing w:after="0" w:line="270"/>
-            </w:pPr>
-            <w:r>
-              <w:rPr>
-                <w:rFonts w:ascii="Calibri" w:cs="Calibri" w:eastAsia="Calibri" w:hAnsi="Calibri"/>
-                <w:b w:val="false"/>
-                <w:bCs w:val="false"/>
-                <w:color w:val="222222"/>
-                <w:sz w:val="20"/>
-                <w:szCs w:val="20"/>
-              </w:rPr>
-              <w:t xml:space="preserve">Safe and reversible</w:t>
+            <w:tcW w:type="dxa" w:w="2700"/>
+            <w:tcBorders>
+              <w:top w:val="single" w:color="BFBFBF" w:sz="4"/>
+              <w:left w:val="single" w:color="BFBFBF" w:sz="4"/>
+              <w:bottom w:val="single" w:color="BFBFBF" w:sz="4"/>
+              <w:right w:val="single" w:color="BFBFBF" w:sz="4"/>
+            </w:tcBorders>
+            <w:tcMar>
+              <w:top w:type="dxa" w:w="60"/>
+              <w:left w:type="dxa" w:w="100"/>
+              <w:bottom w:type="dxa" w:w="60"/>
+              <w:right w:type="dxa" w:w="100"/>
+            </w:tcMar>
+          </w:tcPr>
+          <w:p>
+            <w:pPr>
+              <w:spacing w:after="0" w:line="270"/>
+            </w:pPr>
+            <w:r>
+              <w:rPr>
+                <w:rFonts w:ascii="Calibri" w:cs="Calibri" w:eastAsia="Calibri" w:hAnsi="Calibri"/>
+                <w:b w:val="false"/>
+                <w:bCs w:val="false"/>
+                <w:color w:val="222222"/>
+                <w:sz w:val="20"/>
+                <w:szCs w:val="20"/>
+              </w:rPr>
+              <w:t xml:space="preserve">Allow — runs without prompts</w:t>
             </w:r>
           </w:p>
         </w:tc>
         <w:tc>
           <w:tcPr>
             <w:tcW w:type="dxa" w:w="3800"/>
+            <w:tcBorders>
+              <w:top w:val="single" w:color="BFBFBF" w:sz="4"/>
+              <w:left w:val="single" w:color="BFBFBF" w:sz="4"/>
+              <w:bottom w:val="single" w:color="BFBFBF" w:sz="4"/>
+              <w:right w:val="single" w:color="BFBFBF" w:sz="4"/>
+            </w:tcBorders>
+            <w:tcMar>
+              <w:top w:type="dxa" w:w="60"/>
+              <w:left w:type="dxa" w:w="100"/>
+              <w:bottom w:type="dxa" w:w="60"/>
+              <w:right w:type="dxa" w:w="100"/>
+            </w:tcMar>
+          </w:tcPr>
+          <w:p>
+            <w:pPr>
+              <w:spacing w:after="0" w:line="270"/>
+            </w:pPr>
+            <w:r>
+              <w:rPr>
+                <w:rFonts w:ascii="Calibri" w:cs="Calibri" w:eastAsia="Calibri" w:hAnsi="Calibri"/>
+                <w:b w:val="false"/>
+                <w:bCs w:val="false"/>
+                <w:color w:val="222222"/>
+                <w:sz w:val="20"/>
+                <w:szCs w:val="20"/>
+              </w:rPr>
+              <w:t xml:space="preserve">Per-user command allowlist in Cursor settings (each developer tunes their own)</w:t>
+            </w:r>
+          </w:p>
+        </w:tc>
+        <w:tc>
+          <w:tcPr>
+            <w:tcW w:type="dxa" w:w="2700"/>
             <w:tcBorders>
               <w:top w:val="single" w:color="BFBFBF" w:sz="4"/>
               <w:left w:val="single" w:color="BFBFBF" w:sz="4"/>
@@ -455,73 +473,73 @@
       <w:tr>
         <w:tc>
           <w:tcPr>
-            <w:tcW w:type="dxa" w:w="2500"/>
-            <w:tcBorders>
-              <w:top w:val="single" w:color="BFBFBF" w:sz="4"/>
-              <w:left w:val="single" w:color="BFBFBF" w:sz="4"/>
-              <w:bottom w:val="single" w:color="BFBFBF" w:sz="4"/>
-              <w:right w:val="single" w:color="BFBFBF" w:sz="4"/>
-            </w:tcBorders>
-            <w:tcMar>
-              <w:top w:type="dxa" w:w="60"/>
-              <w:left w:type="dxa" w:w="100"/>
-              <w:bottom w:type="dxa" w:w="60"/>
-              <w:right w:type="dxa" w:w="100"/>
-            </w:tcMar>
-          </w:tcPr>
-          <w:p>
-            <w:pPr>
-              <w:spacing w:after="0" w:line="270"/>
-            </w:pPr>
-            <w:r>
-              <w:rPr>
-                <w:rFonts w:ascii="Calibri" w:cs="Calibri" w:eastAsia="Calibri" w:hAnsi="Calibri"/>
-                <w:b w:val="false"/>
-                <w:bCs w:val="false"/>
-                <w:color w:val="222222"/>
-                <w:sz w:val="20"/>
-                <w:szCs w:val="20"/>
-              </w:rPr>
-              <w:t xml:space="preserve">Ask — needs approval</w:t>
-            </w:r>
-          </w:p>
-        </w:tc>
-        <w:tc>
-          <w:tcPr>
-            <w:tcW w:type="dxa" w:w="2900"/>
-            <w:tcBorders>
-              <w:top w:val="single" w:color="BFBFBF" w:sz="4"/>
-              <w:left w:val="single" w:color="BFBFBF" w:sz="4"/>
-              <w:bottom w:val="single" w:color="BFBFBF" w:sz="4"/>
-              <w:right w:val="single" w:color="BFBFBF" w:sz="4"/>
-            </w:tcBorders>
-            <w:tcMar>
-              <w:top w:type="dxa" w:w="60"/>
-              <w:left w:type="dxa" w:w="100"/>
-              <w:bottom w:type="dxa" w:w="60"/>
-              <w:right w:type="dxa" w:w="100"/>
-            </w:tcMar>
-          </w:tcPr>
-          <w:p>
-            <w:pPr>
-              <w:spacing w:after="0" w:line="270"/>
-            </w:pPr>
-            <w:r>
-              <w:rPr>
-                <w:rFonts w:ascii="Calibri" w:cs="Calibri" w:eastAsia="Calibri" w:hAnsi="Calibri"/>
-                <w:b w:val="false"/>
-                <w:bCs w:val="false"/>
-                <w:color w:val="222222"/>
-                <w:sz w:val="20"/>
-                <w:szCs w:val="20"/>
-              </w:rPr>
-              <w:t xml:space="preserve">Effects beyond the machine</w:t>
+            <w:tcW w:type="dxa" w:w="2700"/>
+            <w:tcBorders>
+              <w:top w:val="single" w:color="BFBFBF" w:sz="4"/>
+              <w:left w:val="single" w:color="BFBFBF" w:sz="4"/>
+              <w:bottom w:val="single" w:color="BFBFBF" w:sz="4"/>
+              <w:right w:val="single" w:color="BFBFBF" w:sz="4"/>
+            </w:tcBorders>
+            <w:tcMar>
+              <w:top w:type="dxa" w:w="60"/>
+              <w:left w:type="dxa" w:w="100"/>
+              <w:bottom w:type="dxa" w:w="60"/>
+              <w:right w:type="dxa" w:w="100"/>
+            </w:tcMar>
+          </w:tcPr>
+          <w:p>
+            <w:pPr>
+              <w:spacing w:after="0" w:line="270"/>
+            </w:pPr>
+            <w:r>
+              <w:rPr>
+                <w:rFonts w:ascii="Calibri" w:cs="Calibri" w:eastAsia="Calibri" w:hAnsi="Calibri"/>
+                <w:b w:val="false"/>
+                <w:bCs w:val="false"/>
+                <w:color w:val="222222"/>
+                <w:sz w:val="20"/>
+                <w:szCs w:val="20"/>
+              </w:rPr>
+              <w:t xml:space="preserve">Ask — stops for approval</w:t>
             </w:r>
           </w:p>
         </w:tc>
         <w:tc>
           <w:tcPr>
             <w:tcW w:type="dxa" w:w="3800"/>
+            <w:tcBorders>
+              <w:top w:val="single" w:color="BFBFBF" w:sz="4"/>
+              <w:left w:val="single" w:color="BFBFBF" w:sz="4"/>
+              <w:bottom w:val="single" w:color="BFBFBF" w:sz="4"/>
+              <w:right w:val="single" w:color="BFBFBF" w:sz="4"/>
+            </w:tcBorders>
+            <w:tcMar>
+              <w:top w:type="dxa" w:w="60"/>
+              <w:left w:type="dxa" w:w="100"/>
+              <w:bottom w:type="dxa" w:w="60"/>
+              <w:right w:type="dxa" w:w="100"/>
+            </w:tcMar>
+          </w:tcPr>
+          <w:p>
+            <w:pPr>
+              <w:spacing w:after="0" w:line="270"/>
+            </w:pPr>
+            <w:r>
+              <w:rPr>
+                <w:rFonts w:ascii="Calibri" w:cs="Calibri" w:eastAsia="Calibri" w:hAnsi="Calibri"/>
+                <w:b w:val="false"/>
+                <w:bCs w:val="false"/>
+                <w:color w:val="222222"/>
+                <w:sz w:val="20"/>
+                <w:szCs w:val="20"/>
+              </w:rPr>
+              <w:t xml:space="preserve">Cursor's built-in command approval — the default behavior for terminal commands</w:t>
+            </w:r>
+          </w:p>
+        </w:tc>
+        <w:tc>
+          <w:tcPr>
+            <w:tcW w:type="dxa" w:w="2700"/>
             <w:tcBorders>
               <w:top w:val="single" w:color="BFBFBF" w:sz="4"/>
               <w:left w:val="single" w:color="BFBFBF" w:sz="4"/>
@@ -556,67 +574,34 @@
       <w:tr>
         <w:tc>
           <w:tcPr>
-            <w:tcW w:type="dxa" w:w="2500"/>
-            <w:tcBorders>
-              <w:top w:val="single" w:color="BFBFBF" w:sz="4"/>
-              <w:left w:val="single" w:color="BFBFBF" w:sz="4"/>
-              <w:bottom w:val="single" w:color="BFBFBF" w:sz="4"/>
-              <w:right w:val="single" w:color="BFBFBF" w:sz="4"/>
-            </w:tcBorders>
-            <w:tcMar>
-              <w:top w:type="dxa" w:w="60"/>
-              <w:left w:type="dxa" w:w="100"/>
-              <w:bottom w:type="dxa" w:w="60"/>
-              <w:right w:type="dxa" w:w="100"/>
-            </w:tcMar>
-          </w:tcPr>
-          <w:p>
-            <w:pPr>
-              <w:spacing w:after="0" w:line="270"/>
-            </w:pPr>
-            <w:r>
-              <w:rPr>
-                <w:rFonts w:ascii="Calibri" w:cs="Calibri" w:eastAsia="Calibri" w:hAnsi="Calibri"/>
-                <w:b w:val="false"/>
-                <w:bCs w:val="false"/>
-                <w:color w:val="222222"/>
-                <w:sz w:val="20"/>
-                <w:szCs w:val="20"/>
-              </w:rPr>
-              <w:t xml:space="preserve">Deny — auto-rejected</w:t>
-            </w:r>
-          </w:p>
-        </w:tc>
-        <w:tc>
-          <w:tcPr>
-            <w:tcW w:type="dxa" w:w="2900"/>
-            <w:tcBorders>
-              <w:top w:val="single" w:color="BFBFBF" w:sz="4"/>
-              <w:left w:val="single" w:color="BFBFBF" w:sz="4"/>
-              <w:bottom w:val="single" w:color="BFBFBF" w:sz="4"/>
-              <w:right w:val="single" w:color="BFBFBF" w:sz="4"/>
-            </w:tcBorders>
-            <w:tcMar>
-              <w:top w:type="dxa" w:w="60"/>
-              <w:left w:type="dxa" w:w="100"/>
-              <w:bottom w:type="dxa" w:w="60"/>
-              <w:right w:type="dxa" w:w="100"/>
-            </w:tcMar>
-          </w:tcPr>
-          <w:p>
-            <w:pPr>
-              <w:spacing w:after="0" w:line="270"/>
-            </w:pPr>
-            <w:r>
-              <w:rPr>
-                <w:rFonts w:ascii="Calibri" w:cs="Calibri" w:eastAsia="Calibri" w:hAnsi="Calibri"/>
-                <w:b w:val="false"/>
-                <w:bCs w:val="false"/>
-                <w:color w:val="222222"/>
-                <w:sz w:val="20"/>
-                <w:szCs w:val="20"/>
-              </w:rPr>
-              <w:t xml:space="preserve">Dangerous or secrets</w:t>
+            <w:tcW w:type="dxa" w:w="2700"/>
+            <w:tcBorders>
+              <w:top w:val="single" w:color="BFBFBF" w:sz="4"/>
+              <w:left w:val="single" w:color="BFBFBF" w:sz="4"/>
+              <w:bottom w:val="single" w:color="BFBFBF" w:sz="4"/>
+              <w:right w:val="single" w:color="BFBFBF" w:sz="4"/>
+            </w:tcBorders>
+            <w:tcMar>
+              <w:top w:type="dxa" w:w="60"/>
+              <w:left w:type="dxa" w:w="100"/>
+              <w:bottom w:type="dxa" w:w="60"/>
+              <w:right w:type="dxa" w:w="100"/>
+            </w:tcMar>
+          </w:tcPr>
+          <w:p>
+            <w:pPr>
+              <w:spacing w:after="0" w:line="270"/>
+            </w:pPr>
+            <w:r>
+              <w:rPr>
+                <w:rFonts w:ascii="Calibri" w:cs="Calibri" w:eastAsia="Calibri" w:hAnsi="Calibri"/>
+                <w:b w:val="false"/>
+                <w:bCs w:val="false"/>
+                <w:color w:val="222222"/>
+                <w:sz w:val="20"/>
+                <w:szCs w:val="20"/>
+              </w:rPr>
+              <w:t xml:space="preserve">Deny — impossible regardless of intent</w:t>
             </w:r>
           </w:p>
         </w:tc>
@@ -649,7 +634,40 @@
                 <w:sz w:val="20"/>
                 <w:szCs w:val="20"/>
               </w:rPr>
-              <w:t xml:space="preserve">key files, store builds, destructive commands</w:t>
+              <w:t xml:space="preserve">Repository hooks (next section) — shared via git, identical for every teammate</w:t>
+            </w:r>
+          </w:p>
+        </w:tc>
+        <w:tc>
+          <w:tcPr>
+            <w:tcW w:type="dxa" w:w="2700"/>
+            <w:tcBorders>
+              <w:top w:val="single" w:color="BFBFBF" w:sz="4"/>
+              <w:left w:val="single" w:color="BFBFBF" w:sz="4"/>
+              <w:bottom w:val="single" w:color="BFBFBF" w:sz="4"/>
+              <w:right w:val="single" w:color="BFBFBF" w:sz="4"/>
+            </w:tcBorders>
+            <w:tcMar>
+              <w:top w:type="dxa" w:w="60"/>
+              <w:left w:type="dxa" w:w="100"/>
+              <w:bottom w:type="dxa" w:w="60"/>
+              <w:right w:type="dxa" w:w="100"/>
+            </w:tcMar>
+          </w:tcPr>
+          <w:p>
+            <w:pPr>
+              <w:spacing w:after="0" w:line="270"/>
+            </w:pPr>
+            <w:r>
+              <w:rPr>
+                <w:rFonts w:ascii="Calibri" w:cs="Calibri" w:eastAsia="Calibri" w:hAnsi="Calibri"/>
+                <w:b w:val="false"/>
+                <w:bCs w:val="false"/>
+                <w:color w:val="222222"/>
+                <w:sz w:val="20"/>
+                <w:szCs w:val="20"/>
+              </w:rPr>
+              <w:t xml:space="preserve">production targets, secret files, destructive commands</w:t>
             </w:r>
           </w:p>
         </w:tc>
@@ -670,7 +688,7 @@
           <w:sz w:val="22"/>
           <w:szCs w:val="22"/>
         </w:rPr>
-        <w:t xml:space="preserve">Result: routine work flows fast; consequential decisions always stop at a human.</w:t>
+        <w:t xml:space="preserve">The bucket that matters most — Deny — is the one that lives in the repository and reaches every teammate automatically with a clone; Allow/Ask tuning stays personal per developer.</w:t>
       </w:r>
     </w:p>
     <w:p>

</xml_diff>

<commit_message>
Section 14 updated: RDS snapshot clone replaces pg_dump, Seer->Cursor native shortcut documented as manual quick path; speaking script slide 10 updated to match
</commit_message>
<xml_diff>
--- a/slides/ai-first-technical-brief.docx
+++ b/slides/ai-first-technical-brief.docx
@@ -2944,7 +2944,7 @@
           <w:sz w:val="22"/>
           <w:szCs w:val="22"/>
         </w:rPr>
-        <w:t xml:space="preserve">–  Database (backend): a nightly pg_dump runs INSIDE our network and uploads to private storage (S3). The CI job downloads the latest dump into a disposable local PostgreSQL container that dies with the run. Staging is never exposed: no inbound access, no IP allowlisting — GitHub-hosted runners have no static IPs, so this design removes the question entirely.</w:t>
+        <w:t xml:space="preserve">–  Database (backend): we are on AWS RDS — Amazon already takes nightly snapshots. The pipeline clones a disposable database from the latest snapshot with one API call (fast regardless of size — no dumps, no data transfer), the agent works only on the clone, and it is deleted when the run ends. Staging itself is never touched and never exposed. This requires the runner to live inside our VPC: a small EC2 self-hosted runner with a narrowly-scoped IAM role (restore snapshot / delete its own clones — nothing else).</w:t>
       </w:r>
     </w:p>
     <w:p>
@@ -2981,7 +2981,32 @@
           <w:sz w:val="22"/>
           <w:szCs w:val="22"/>
         </w:rPr>
-        <w:t xml:space="preserve">Required secrets: CURSOR_API_KEY, SENTRY_AUTH_TOKEN (read-only scopes), LINEAR_API_KEY, and read keys for the dump storage. Safety rails: one run per issue (concurrency lock), a PR is never opened with failing tests, Sentry stays read-only end to end, and merging remains a human decision.</w:t>
+        <w:t xml:space="preserve">Required secrets: CURSOR_API_KEY, SENTRY_AUTH_TOKEN (read-only scopes), LINEAR_API_KEY, and a narrowly-scoped IAM role for snapshot cloning. Safety rails: one run per issue (concurrency lock), a PR is never opened with failing tests, Sentry stays read-only end to end, and merging remains a human decision.</w:t>
+      </w:r>
+    </w:p>
+    <w:p>
+      <w:pPr>
+        <w:spacing w:after="120" w:line="300"/>
+      </w:pPr>
+      <w:r>
+        <w:rPr>
+          <w:rFonts w:ascii="Calibri" w:cs="Calibri" w:eastAsia="Calibri" w:hAnsi="Calibri"/>
+          <w:b/>
+          <w:bCs/>
+          <w:color w:val="222222"/>
+          <w:sz w:val="22"/>
+          <w:szCs w:val="22"/>
+        </w:rPr>
+        <w:t xml:space="preserve">A native shortcut exists — and we use it too: </w:t>
+      </w:r>
+      <w:r>
+        <w:rPr>
+          <w:rFonts w:ascii="Calibri" w:cs="Calibri" w:eastAsia="Calibri" w:hAnsi="Calibri"/>
+          <w:color w:val="222222"/>
+          <w:sz w:val="22"/>
+          <w:szCs w:val="22"/>
+        </w:rPr>
+        <w:t xml:space="preserve">Sentry's Seer can hand an issue directly to a Cursor Cloud Agent (one click from the issue page, or automatically), which fixes the bug and opens a PR. We enable it as the manual quick path for hot individual bugs. The pipeline above remains the governed path: the native integration fixes code, but it does not run our process — the Linear choreography (dedupe, close-out, “In Review from AI”), the branch strategy (staging → qa, carried back to dev), the failing-test-first rule, or the database clone. Convenience where speed matters; our pipeline where policy matters.</w:t>
       </w:r>
     </w:p>
     <w:tbl>

</xml_diff>